<commit_message>
Cite the public BDSP DUA/license URLs (manuscript, checklist, README); participants.tsv uploaded (4,912 rows); only the orphan-session delete remains manual
Co-Authored-By: Claude Fable 5.1 <noreply@anthropic.com>
</commit_message>
<xml_diff>
--- a/manuscript-materials/scidata/Human_Data_Checklist_FILLED.docx
+++ b/manuscript-materials/scidata/Human_Data_Checklist_FILLED.docx
@@ -2840,7 +2840,7 @@
                                 <w:i/>
                                 <w:iCs/>
                               </w:rPr>
-                              <w:t xml:space="preserve">The BDSP data use agreement is presented to every user during registration at https://bdsp.io (dataset page: https://bdsp.io/content/nf89816gtxbon11kbr9a/1.0/). A copy is supplied as a Related Manuscript file.</w:t>
+                              <w:t xml:space="preserve">The BDSP Credentialed Health Data Use Agreement is publicly viewable at https://bdsp.io/content/nf89816gtxbon11kbr9a/view-dua/1.0/ (license: https://bdsp.io/content/nf89816gtxbon11kbr9a/view-license/1.0/) and is presented to every user during registration on bdsp.io.</w:t>
                             </w:r>
                             <w:proofErr w:type="gramStart"/>
                             <w:r>
@@ -2914,7 +2914,7 @@
                           <w:i/>
                           <w:iCs/>
                         </w:rPr>
-                        <w:t xml:space="preserve">The BDSP data use agreement is presented to every user during registration at https://bdsp.io (dataset page: https://bdsp.io/content/nf89816gtxbon11kbr9a/1.0/). A copy is supplied as a Related Manuscript file.</w:t>
+                        <w:t xml:space="preserve">The BDSP Credentialed Health Data Use Agreement is publicly viewable at https://bdsp.io/content/nf89816gtxbon11kbr9a/view-dua/1.0/ (license: https://bdsp.io/content/nf89816gtxbon11kbr9a/view-license/1.0/) and is presented to every user during registration on bdsp.io.</w:t>
                       </w:r>
                       <w:proofErr w:type="gramStart"/>
                       <w:r>

</xml_diff>

<commit_message>
Human Data Checklist signed and dated
Co-Authored-By: Claude Fable 5.1 <noreply@anthropic.com>
</commit_message>
<xml_diff>
--- a/manuscript-materials/scidata/Human_Data_Checklist_FILLED.docx
+++ b/manuscript-materials/scidata/Human_Data_Checklist_FILLED.docx
@@ -3667,7 +3667,6 @@
                           <w:sdt>
                             <w:sdtPr>
                               <w:id w:val="1076938441"/>
-                              <w:showingPlcHdr/>
                               <w:text/>
                             </w:sdtPr>
                             <w:sdtContent>
@@ -3676,7 +3675,7 @@
                                   <w:rPr>
                                     <w:rStyle w:val="PlaceholderText"/>
                                   </w:rPr>
-                                  <w:t>Click here to enter text.</w:t>
+                                  <w:t xml:space="preserve">M. Brandon Westover</w:t>
                                 </w:r>
                               </w:p>
                             </w:sdtContent>
@@ -3707,7 +3706,6 @@
                       <w:sdtPr>
                         <w:id w:val="100158920"/>
                         <w:id w:val="1076938441"/>
-                        <w:showingPlcHdr/>
                         <w:text/>
                       </w:sdtPr>
                       <w:sdtContent>
@@ -3716,7 +3714,7 @@
                             <w:rPr>
                               <w:rStyle w:val="PlaceholderText"/>
                             </w:rPr>
-                            <w:t>Click here to enter text.</w:t>
+                            <w:t xml:space="preserve">M. Brandon Westover</w:t>
                           </w:r>
                         </w:p>
                       </w:sdtContent>
@@ -3782,7 +3780,6 @@
                           <w:sdt>
                             <w:sdtPr>
                               <w:id w:val="1778676248"/>
-                              <w:showingPlcHdr/>
                               <w:text/>
                             </w:sdtPr>
                             <w:sdtContent>
@@ -3791,7 +3788,7 @@
                                   <w:rPr>
                                     <w:rStyle w:val="PlaceholderText"/>
                                   </w:rPr>
-                                  <w:t>Click here to enter text.</w:t>
+                                  <w:t xml:space="preserve">12 September 2026</w:t>
                                 </w:r>
                               </w:p>
                             </w:sdtContent>
@@ -3822,7 +3819,6 @@
                       <w:sdtPr>
                         <w:id w:val="1339095543"/>
                         <w:id w:val="1778676248"/>
-                        <w:showingPlcHdr/>
                         <w:text/>
                       </w:sdtPr>
                       <w:sdtContent>
@@ -3831,7 +3827,7 @@
                             <w:rPr>
                               <w:rStyle w:val="PlaceholderText"/>
                             </w:rPr>
-                            <w:t>Click here to enter text.</w:t>
+                            <w:t xml:space="preserve">12 September 2026</w:t>
                           </w:r>
                         </w:p>
                       </w:sdtContent>

</xml_diff>

<commit_message>
Checklist: signature and date in the correct boxes
Co-Authored-By: Claude Fable 5.1 <noreply@anthropic.com>
</commit_message>
<xml_diff>
--- a/manuscript-materials/scidata/Human_Data_Checklist_FILLED.docx
+++ b/manuscript-materials/scidata/Human_Data_Checklist_FILLED.docx
@@ -3675,7 +3675,7 @@
                                   <w:rPr>
                                     <w:rStyle w:val="PlaceholderText"/>
                                   </w:rPr>
-                                  <w:t xml:space="preserve">M. Brandon Westover</w:t>
+                                  <w:t xml:space="preserve">12 September 2026</w:t>
                                 </w:r>
                               </w:p>
                             </w:sdtContent>
@@ -3714,7 +3714,7 @@
                             <w:rPr>
                               <w:rStyle w:val="PlaceholderText"/>
                             </w:rPr>
-                            <w:t xml:space="preserve">M. Brandon Westover</w:t>
+                            <w:t xml:space="preserve">12 September 2026</w:t>
                           </w:r>
                         </w:p>
                       </w:sdtContent>
@@ -3788,7 +3788,7 @@
                                   <w:rPr>
                                     <w:rStyle w:val="PlaceholderText"/>
                                   </w:rPr>
-                                  <w:t xml:space="preserve">12 September 2026</w:t>
+                                  <w:t xml:space="preserve">M. Brandon Westover</w:t>
                                 </w:r>
                               </w:p>
                             </w:sdtContent>
@@ -3827,7 +3827,7 @@
                             <w:rPr>
                               <w:rStyle w:val="PlaceholderText"/>
                             </w:rPr>
-                            <w:t xml:space="preserve">12 September 2026</w:t>
+                            <w:t xml:space="preserve">M. Brandon Westover</w:t>
                           </w:r>
                         </w:p>
                       </w:sdtContent>

</xml_diff>